<commit_message>
Bachelor afleveret, nu bare forsvar tilbage
</commit_message>
<xml_diff>
--- a/7. Semester/Tex udtrækning/Word.docx
+++ b/7. Semester/Tex udtrækning/Word.docx
@@ -4,51 +4,488 @@
   <w:body>
     <w:p>
       <m:oMath>
-        <m:sSub>
-          <m:sSubPr>
+        <m:f>
+          <m:fPr>
             <m:ctrlPr>
               <w:rPr>
                 <w:rFonts w:ascii="Cambria Math" w:hAnsi="Cambria Math"/>
                 <w:i/>
               </w:rPr>
             </m:ctrlPr>
-          </m:sSubPr>
-          <m:e>
+          </m:fPr>
+          <m:num>
             <m:r>
               <w:rPr>
                 <w:rFonts w:ascii="Cambria Math" w:hAnsi="Cambria Math"/>
               </w:rPr>
-              <m:t>n</m:t>
+              <m:t>1</m:t>
             </m:r>
-          </m:e>
-          <m:sub>
-            <m:r>
-              <w:rPr>
-                <w:rFonts w:ascii="Cambria Math" w:hAnsi="Cambria Math"/>
-              </w:rPr>
-              <m:t>f</m:t>
-            </m:r>
-          </m:sub>
-        </m:sSub>
+          </m:num>
+          <m:den>
+            <m:d>
+              <m:dPr>
+                <m:ctrlPr>
+                  <w:rPr>
+                    <w:rFonts w:ascii="Cambria Math" w:hAnsi="Cambria Math"/>
+                    <w:i/>
+                  </w:rPr>
+                </m:ctrlPr>
+              </m:dPr>
+              <m:e>
+                <m:r>
+                  <w:rPr>
+                    <w:rFonts w:ascii="Cambria Math" w:hAnsi="Cambria Math"/>
+                  </w:rPr>
+                  <m:t>1-</m:t>
+                </m:r>
+                <m:sSup>
+                  <m:sSupPr>
+                    <m:ctrlPr>
+                      <w:rPr>
+                        <w:rFonts w:ascii="Cambria Math" w:hAnsi="Cambria Math"/>
+                        <w:i/>
+                      </w:rPr>
+                    </m:ctrlPr>
+                  </m:sSupPr>
+                  <m:e>
+                    <m:r>
+                      <w:rPr>
+                        <w:rFonts w:ascii="Cambria Math" w:hAnsi="Cambria Math"/>
+                      </w:rPr>
+                      <m:t>e</m:t>
+                    </m:r>
+                  </m:e>
+                  <m:sup>
+                    <m:r>
+                      <w:rPr>
+                        <w:rFonts w:ascii="Cambria Math" w:hAnsi="Cambria Math"/>
+                      </w:rPr>
+                      <m:t>-</m:t>
+                    </m:r>
+                    <m:r>
+                      <w:rPr>
+                        <w:rFonts w:ascii="Cambria Math" w:hAnsi="Cambria Math"/>
+                      </w:rPr>
+                      <m:t>jω</m:t>
+                    </m:r>
+                  </m:sup>
+                </m:sSup>
+              </m:e>
+            </m:d>
+          </m:den>
+        </m:f>
         <m:r>
           <w:rPr>
             <w:rFonts w:ascii="Cambria Math" w:hAnsi="Cambria Math"/>
-            <w:lang w:val="da-DK"/>
+          </w:rPr>
+          <m:t>·</m:t>
+        </m:r>
+        <m:f>
+          <m:fPr>
+            <m:ctrlPr>
+              <w:rPr>
+                <w:rFonts w:ascii="Cambria Math" w:hAnsi="Cambria Math"/>
+                <w:i/>
+              </w:rPr>
+            </m:ctrlPr>
+          </m:fPr>
+          <m:num>
+            <m:d>
+              <m:dPr>
+                <m:ctrlPr>
+                  <w:rPr>
+                    <w:rFonts w:ascii="Cambria Math" w:hAnsi="Cambria Math"/>
+                    <w:i/>
+                  </w:rPr>
+                </m:ctrlPr>
+              </m:dPr>
+              <m:e>
+                <m:r>
+                  <w:rPr>
+                    <w:rFonts w:ascii="Cambria Math" w:hAnsi="Cambria Math"/>
+                  </w:rPr>
+                  <m:t>1</m:t>
+                </m:r>
+                <m:r>
+                  <w:rPr>
+                    <w:rFonts w:ascii="Cambria Math" w:hAnsi="Cambria Math"/>
+                  </w:rPr>
+                  <m:t>+</m:t>
+                </m:r>
+                <m:sSup>
+                  <m:sSupPr>
+                    <m:ctrlPr>
+                      <w:rPr>
+                        <w:rFonts w:ascii="Cambria Math" w:hAnsi="Cambria Math"/>
+                        <w:i/>
+                      </w:rPr>
+                    </m:ctrlPr>
+                  </m:sSupPr>
+                  <m:e>
+                    <m:r>
+                      <w:rPr>
+                        <w:rFonts w:ascii="Cambria Math" w:hAnsi="Cambria Math"/>
+                      </w:rPr>
+                      <m:t>e</m:t>
+                    </m:r>
+                  </m:e>
+                  <m:sup>
+                    <m:r>
+                      <w:rPr>
+                        <w:rFonts w:ascii="Cambria Math" w:hAnsi="Cambria Math"/>
+                      </w:rPr>
+                      <m:t>jω</m:t>
+                    </m:r>
+                  </m:sup>
+                </m:sSup>
+              </m:e>
+            </m:d>
+          </m:num>
+          <m:den>
+            <m:d>
+              <m:dPr>
+                <m:ctrlPr>
+                  <w:rPr>
+                    <w:rFonts w:ascii="Cambria Math" w:hAnsi="Cambria Math"/>
+                    <w:i/>
+                  </w:rPr>
+                </m:ctrlPr>
+              </m:dPr>
+              <m:e>
+                <m:r>
+                  <w:rPr>
+                    <w:rFonts w:ascii="Cambria Math" w:hAnsi="Cambria Math"/>
+                  </w:rPr>
+                  <m:t>1</m:t>
+                </m:r>
+                <m:r>
+                  <w:rPr>
+                    <w:rFonts w:ascii="Cambria Math" w:hAnsi="Cambria Math"/>
+                  </w:rPr>
+                  <m:t>+</m:t>
+                </m:r>
+                <m:sSup>
+                  <m:sSupPr>
+                    <m:ctrlPr>
+                      <w:rPr>
+                        <w:rFonts w:ascii="Cambria Math" w:hAnsi="Cambria Math"/>
+                        <w:i/>
+                      </w:rPr>
+                    </m:ctrlPr>
+                  </m:sSupPr>
+                  <m:e>
+                    <m:r>
+                      <w:rPr>
+                        <w:rFonts w:ascii="Cambria Math" w:hAnsi="Cambria Math"/>
+                      </w:rPr>
+                      <m:t>e</m:t>
+                    </m:r>
+                  </m:e>
+                  <m:sup>
+                    <m:r>
+                      <w:rPr>
+                        <w:rFonts w:ascii="Cambria Math" w:hAnsi="Cambria Math"/>
+                      </w:rPr>
+                      <m:t>jω</m:t>
+                    </m:r>
+                  </m:sup>
+                </m:sSup>
+              </m:e>
+            </m:d>
+          </m:den>
+        </m:f>
+        <m:r>
+          <w:rPr>
+            <w:rFonts w:ascii="Cambria Math" w:hAnsi="Cambria Math"/>
           </w:rPr>
           <m:t>=</m:t>
         </m:r>
-        <m:rad>
-          <m:radPr>
-            <m:degHide m:val="1"/>
+        <m:f>
+          <m:fPr>
             <m:ctrlPr>
               <w:rPr>
                 <w:rFonts w:ascii="Cambria Math" w:hAnsi="Cambria Math"/>
                 <w:i/>
               </w:rPr>
             </m:ctrlPr>
-          </m:radPr>
-          <m:deg/>
-          <m:e>
+          </m:fPr>
+          <m:num>
+            <m:d>
+              <m:dPr>
+                <m:ctrlPr>
+                  <w:rPr>
+                    <w:rFonts w:ascii="Cambria Math" w:hAnsi="Cambria Math"/>
+                    <w:i/>
+                  </w:rPr>
+                </m:ctrlPr>
+              </m:dPr>
+              <m:e>
+                <m:r>
+                  <w:rPr>
+                    <w:rFonts w:ascii="Cambria Math" w:hAnsi="Cambria Math"/>
+                  </w:rPr>
+                  <m:t>1</m:t>
+                </m:r>
+                <m:r>
+                  <w:rPr>
+                    <w:rFonts w:ascii="Cambria Math" w:hAnsi="Cambria Math"/>
+                  </w:rPr>
+                  <m:t>+</m:t>
+                </m:r>
+                <m:sSup>
+                  <m:sSupPr>
+                    <m:ctrlPr>
+                      <w:rPr>
+                        <w:rFonts w:ascii="Cambria Math" w:hAnsi="Cambria Math"/>
+                        <w:i/>
+                      </w:rPr>
+                    </m:ctrlPr>
+                  </m:sSupPr>
+                  <m:e>
+                    <m:r>
+                      <w:rPr>
+                        <w:rFonts w:ascii="Cambria Math" w:hAnsi="Cambria Math"/>
+                      </w:rPr>
+                      <m:t>e</m:t>
+                    </m:r>
+                  </m:e>
+                  <m:sup>
+                    <m:r>
+                      <w:rPr>
+                        <w:rFonts w:ascii="Cambria Math" w:hAnsi="Cambria Math"/>
+                      </w:rPr>
+                      <m:t>jω</m:t>
+                    </m:r>
+                  </m:sup>
+                </m:sSup>
+              </m:e>
+            </m:d>
+          </m:num>
+          <m:den>
+            <m:sSup>
+              <m:sSupPr>
+                <m:ctrlPr>
+                  <w:rPr>
+                    <w:rFonts w:ascii="Cambria Math" w:hAnsi="Cambria Math"/>
+                    <w:i/>
+                  </w:rPr>
+                </m:ctrlPr>
+              </m:sSupPr>
+              <m:e>
+                <m:r>
+                  <w:rPr>
+                    <w:rFonts w:ascii="Cambria Math" w:hAnsi="Cambria Math"/>
+                  </w:rPr>
+                  <m:t>1</m:t>
+                </m:r>
+              </m:e>
+              <m:sup>
+                <m:r>
+                  <w:rPr>
+                    <w:rFonts w:ascii="Cambria Math" w:hAnsi="Cambria Math"/>
+                  </w:rPr>
+                  <m:t>2</m:t>
+                </m:r>
+              </m:sup>
+            </m:sSup>
+            <m:r>
+              <w:rPr>
+                <w:rFonts w:ascii="Cambria Math" w:hAnsi="Cambria Math"/>
+              </w:rPr>
+              <m:t>+</m:t>
+            </m:r>
+            <m:sSup>
+              <m:sSupPr>
+                <m:ctrlPr>
+                  <w:rPr>
+                    <w:rFonts w:ascii="Cambria Math" w:hAnsi="Cambria Math"/>
+                    <w:i/>
+                  </w:rPr>
+                </m:ctrlPr>
+              </m:sSupPr>
+              <m:e>
+                <m:r>
+                  <w:rPr>
+                    <w:rFonts w:ascii="Cambria Math" w:hAnsi="Cambria Math"/>
+                  </w:rPr>
+                  <m:t>e</m:t>
+                </m:r>
+              </m:e>
+              <m:sup>
+                <m:r>
+                  <w:rPr>
+                    <w:rFonts w:ascii="Cambria Math" w:hAnsi="Cambria Math"/>
+                  </w:rPr>
+                  <m:t>jω</m:t>
+                </m:r>
+              </m:sup>
+            </m:sSup>
+            <m:r>
+              <w:rPr>
+                <w:rFonts w:ascii="Cambria Math" w:hAnsi="Cambria Math"/>
+              </w:rPr>
+              <m:t>-</m:t>
+            </m:r>
+            <m:sSup>
+              <m:sSupPr>
+                <m:ctrlPr>
+                  <w:rPr>
+                    <w:rFonts w:ascii="Cambria Math" w:hAnsi="Cambria Math"/>
+                    <w:i/>
+                  </w:rPr>
+                </m:ctrlPr>
+              </m:sSupPr>
+              <m:e>
+                <m:r>
+                  <w:rPr>
+                    <w:rFonts w:ascii="Cambria Math" w:hAnsi="Cambria Math"/>
+                  </w:rPr>
+                  <m:t>e</m:t>
+                </m:r>
+              </m:e>
+              <m:sup>
+                <m:r>
+                  <w:rPr>
+                    <w:rFonts w:ascii="Cambria Math" w:hAnsi="Cambria Math"/>
+                  </w:rPr>
+                  <m:t>-jω</m:t>
+                </m:r>
+              </m:sup>
+            </m:sSup>
+            <m:r>
+              <w:rPr>
+                <w:rFonts w:ascii="Cambria Math" w:hAnsi="Cambria Math"/>
+              </w:rPr>
+              <m:t>-</m:t>
+            </m:r>
+            <m:sSup>
+              <m:sSupPr>
+                <m:ctrlPr>
+                  <w:rPr>
+                    <w:rFonts w:ascii="Cambria Math" w:hAnsi="Cambria Math"/>
+                    <w:i/>
+                  </w:rPr>
+                </m:ctrlPr>
+              </m:sSupPr>
+              <m:e>
+                <m:r>
+                  <w:rPr>
+                    <w:rFonts w:ascii="Cambria Math" w:hAnsi="Cambria Math"/>
+                  </w:rPr>
+                  <m:t>e</m:t>
+                </m:r>
+              </m:e>
+              <m:sup>
+                <m:r>
+                  <w:rPr>
+                    <w:rFonts w:ascii="Cambria Math" w:hAnsi="Cambria Math"/>
+                  </w:rPr>
+                  <m:t>-jω</m:t>
+                </m:r>
+              </m:sup>
+            </m:sSup>
+            <m:sSup>
+              <m:sSupPr>
+                <m:ctrlPr>
+                  <w:rPr>
+                    <w:rFonts w:ascii="Cambria Math" w:hAnsi="Cambria Math"/>
+                    <w:i/>
+                  </w:rPr>
+                </m:ctrlPr>
+              </m:sSupPr>
+              <m:e>
+                <m:r>
+                  <w:rPr>
+                    <w:rFonts w:ascii="Cambria Math" w:hAnsi="Cambria Math"/>
+                  </w:rPr>
+                  <m:t>e</m:t>
+                </m:r>
+              </m:e>
+              <m:sup>
+                <m:r>
+                  <w:rPr>
+                    <w:rFonts w:ascii="Cambria Math" w:hAnsi="Cambria Math"/>
+                  </w:rPr>
+                  <m:t>jω</m:t>
+                </m:r>
+              </m:sup>
+            </m:sSup>
+          </m:den>
+        </m:f>
+        <m:r>
+          <w:rPr>
+            <w:rFonts w:ascii="Cambria Math" w:hAnsi="Cambria Math"/>
+          </w:rPr>
+          <m:t>=</m:t>
+        </m:r>
+        <m:f>
+          <m:fPr>
+            <m:ctrlPr>
+              <w:rPr>
+                <w:rFonts w:ascii="Cambria Math" w:hAnsi="Cambria Math"/>
+                <w:i/>
+              </w:rPr>
+            </m:ctrlPr>
+          </m:fPr>
+          <m:num>
+            <m:d>
+              <m:dPr>
+                <m:ctrlPr>
+                  <w:rPr>
+                    <w:rFonts w:ascii="Cambria Math" w:hAnsi="Cambria Math"/>
+                    <w:i/>
+                  </w:rPr>
+                </m:ctrlPr>
+              </m:dPr>
+              <m:e>
+                <m:r>
+                  <w:rPr>
+                    <w:rFonts w:ascii="Cambria Math" w:hAnsi="Cambria Math"/>
+                  </w:rPr>
+                  <m:t>1</m:t>
+                </m:r>
+                <m:r>
+                  <w:rPr>
+                    <w:rFonts w:ascii="Cambria Math" w:hAnsi="Cambria Math"/>
+                  </w:rPr>
+                  <m:t>+</m:t>
+                </m:r>
+                <m:sSup>
+                  <m:sSupPr>
+                    <m:ctrlPr>
+                      <w:rPr>
+                        <w:rFonts w:ascii="Cambria Math" w:hAnsi="Cambria Math"/>
+                        <w:i/>
+                      </w:rPr>
+                    </m:ctrlPr>
+                  </m:sSupPr>
+                  <m:e>
+                    <m:r>
+                      <w:rPr>
+                        <w:rFonts w:ascii="Cambria Math" w:hAnsi="Cambria Math"/>
+                      </w:rPr>
+                      <m:t>e</m:t>
+                    </m:r>
+                  </m:e>
+                  <m:sup>
+                    <m:r>
+                      <w:rPr>
+                        <w:rFonts w:ascii="Cambria Math" w:hAnsi="Cambria Math"/>
+                      </w:rPr>
+                      <m:t>jω</m:t>
+                    </m:r>
+                  </m:sup>
+                </m:sSup>
+              </m:e>
+            </m:d>
+          </m:num>
+          <m:den>
+            <m:r>
+              <w:rPr>
+                <w:rFonts w:ascii="Cambria Math" w:hAnsi="Cambria Math"/>
+              </w:rPr>
+              <m:t>2j·</m:t>
+            </m:r>
             <m:f>
               <m:fPr>
                 <m:ctrlPr>
@@ -59,154 +496,16 @@
                 </m:ctrlPr>
               </m:fPr>
               <m:num>
-                <m:r>
-                  <w:rPr>
-                    <w:rFonts w:ascii="Cambria Math" w:hAnsi="Cambria Math"/>
-                  </w:rPr>
-                  <m:t>c</m:t>
-                </m:r>
-              </m:num>
-              <m:den>
-                <m:r>
-                  <w:rPr>
-                    <w:rFonts w:ascii="Cambria Math" w:hAnsi="Cambria Math"/>
-                  </w:rPr>
-                  <m:t>j</m:t>
-                </m:r>
-                <m:r>
-                  <w:rPr>
-                    <w:rFonts w:ascii="Cambria Math" w:hAnsi="Cambria Math"/>
-                    <w:lang w:val="da-DK"/>
-                  </w:rPr>
-                  <m:t>·</m:t>
-                </m:r>
-                <m:r>
-                  <w:rPr>
-                    <w:rFonts w:ascii="Cambria Math" w:hAnsi="Cambria Math"/>
-                  </w:rPr>
-                  <m:t>ω</m:t>
-                </m:r>
-                <m:r>
-                  <w:rPr>
-                    <w:rFonts w:ascii="Cambria Math" w:hAnsi="Cambria Math"/>
-                    <w:lang w:val="da-DK"/>
-                  </w:rPr>
-                  <m:t>·</m:t>
-                </m:r>
-                <m:sSub>
-                  <m:sSubPr>
+                <m:d>
+                  <m:dPr>
                     <m:ctrlPr>
                       <w:rPr>
                         <w:rFonts w:ascii="Cambria Math" w:hAnsi="Cambria Math"/>
                         <w:i/>
                       </w:rPr>
                     </m:ctrlPr>
-                  </m:sSubPr>
+                  </m:dPr>
                   <m:e>
-                    <m:r>
-                      <w:rPr>
-                        <w:rFonts w:ascii="Cambria Math" w:hAnsi="Cambria Math"/>
-                      </w:rPr>
-                      <m:t>d</m:t>
-                    </m:r>
-                  </m:e>
-                  <m:sub>
-                    <m:r>
-                      <w:rPr>
-                        <w:rFonts w:ascii="Cambria Math" w:hAnsi="Cambria Math"/>
-                      </w:rPr>
-                      <m:t>f</m:t>
-                    </m:r>
-                  </m:sub>
-                </m:sSub>
-              </m:den>
-            </m:f>
-            <m:r>
-              <w:rPr>
-                <w:rFonts w:ascii="Cambria Math" w:hAnsi="Cambria Math"/>
-                <w:lang w:val="da-DK"/>
-              </w:rPr>
-              <m:t>·</m:t>
-            </m:r>
-            <m:d>
-              <m:dPr>
-                <m:ctrlPr>
-                  <w:rPr>
-                    <w:rFonts w:ascii="Cambria Math" w:hAnsi="Cambria Math"/>
-                    <w:i/>
-                  </w:rPr>
-                </m:ctrlPr>
-              </m:dPr>
-              <m:e>
-                <m:sSub>
-                  <m:sSubPr>
-                    <m:ctrlPr>
-                      <w:rPr>
-                        <w:rFonts w:ascii="Cambria Math" w:hAnsi="Cambria Math"/>
-                        <w:i/>
-                      </w:rPr>
-                    </m:ctrlPr>
-                  </m:sSubPr>
-                  <m:e>
-                    <m:r>
-                      <w:rPr>
-                        <w:rFonts w:ascii="Cambria Math" w:hAnsi="Cambria Math"/>
-                      </w:rPr>
-                      <m:t>n</m:t>
-                    </m:r>
-                  </m:e>
-                  <m:sub>
-                    <m:r>
-                      <w:rPr>
-                        <w:rFonts w:ascii="Cambria Math" w:hAnsi="Cambria Math"/>
-                      </w:rPr>
-                      <m:t>ref</m:t>
-                    </m:r>
-                  </m:sub>
-                </m:sSub>
-                <m:r>
-                  <w:rPr>
-                    <w:rFonts w:ascii="Cambria Math" w:hAnsi="Cambria Math"/>
-                    <w:lang w:val="da-DK"/>
-                  </w:rPr>
-                  <m:t>+1</m:t>
-                </m:r>
-              </m:e>
-            </m:d>
-            <m:r>
-              <w:rPr>
-                <w:rFonts w:ascii="Cambria Math" w:hAnsi="Cambria Math"/>
-                <w:lang w:val="da-DK"/>
-              </w:rPr>
-              <m:t>·</m:t>
-            </m:r>
-            <m:d>
-              <m:dPr>
-                <m:ctrlPr>
-                  <w:rPr>
-                    <w:rFonts w:ascii="Cambria Math" w:hAnsi="Cambria Math"/>
-                    <w:i/>
-                  </w:rPr>
-                </m:ctrlPr>
-              </m:dPr>
-              <m:e>
-                <m:r>
-                  <w:rPr>
-                    <w:rFonts w:ascii="Cambria Math" w:hAnsi="Cambria Math"/>
-                    <w:lang w:val="da-DK"/>
-                  </w:rPr>
-                  <m:t>1-</m:t>
-                </m:r>
-                <m:f>
-                  <m:fPr>
-                    <m:ctrlPr>
-                      <w:rPr>
-                        <w:rFonts w:ascii="Cambria Math" w:hAnsi="Cambria Math"/>
-                        <w:i/>
-                      </w:rPr>
-                    </m:ctrlPr>
-                  </m:fPr>
-                  <m:num>
                     <m:sSup>
                       <m:sSupPr>
                         <m:ctrlPr>
@@ -225,165 +524,1628 @@
                         </m:r>
                       </m:e>
                       <m:sup>
-                        <m:sSub>
-                          <m:sSubPr>
+                        <m:r>
+                          <w:rPr>
+                            <w:rFonts w:ascii="Cambria Math" w:hAnsi="Cambria Math"/>
+                          </w:rPr>
+                          <m:t>jω</m:t>
+                        </m:r>
+                      </m:sup>
+                    </m:sSup>
+                    <m:r>
+                      <w:rPr>
+                        <w:rFonts w:ascii="Cambria Math" w:hAnsi="Cambria Math"/>
+                      </w:rPr>
+                      <m:t>-</m:t>
+                    </m:r>
+                    <m:sSup>
+                      <m:sSupPr>
+                        <m:ctrlPr>
+                          <w:rPr>
+                            <w:rFonts w:ascii="Cambria Math" w:hAnsi="Cambria Math"/>
+                            <w:i/>
+                          </w:rPr>
+                        </m:ctrlPr>
+                      </m:sSupPr>
+                      <m:e>
+                        <m:r>
+                          <w:rPr>
+                            <w:rFonts w:ascii="Cambria Math" w:hAnsi="Cambria Math"/>
+                          </w:rPr>
+                          <m:t>e</m:t>
+                        </m:r>
+                      </m:e>
+                      <m:sup>
+                        <m:r>
+                          <w:rPr>
+                            <w:rFonts w:ascii="Cambria Math" w:hAnsi="Cambria Math"/>
+                          </w:rPr>
+                          <m:t>-jω</m:t>
+                        </m:r>
+                      </m:sup>
+                    </m:sSup>
+                  </m:e>
+                </m:d>
+              </m:num>
+              <m:den>
+                <m:r>
+                  <w:rPr>
+                    <w:rFonts w:ascii="Cambria Math" w:hAnsi="Cambria Math"/>
+                  </w:rPr>
+                  <m:t>2j</m:t>
+                </m:r>
+              </m:den>
+            </m:f>
+          </m:den>
+        </m:f>
+        <m:r>
+          <w:rPr>
+            <w:rFonts w:ascii="Cambria Math" w:hAnsi="Cambria Math"/>
+          </w:rPr>
+          <m:t>=</m:t>
+        </m:r>
+        <m:f>
+          <m:fPr>
+            <m:ctrlPr>
+              <w:rPr>
+                <w:rFonts w:ascii="Cambria Math" w:hAnsi="Cambria Math"/>
+                <w:i/>
+              </w:rPr>
+            </m:ctrlPr>
+          </m:fPr>
+          <m:num>
+            <m:f>
+              <m:fPr>
+                <m:ctrlPr>
+                  <w:rPr>
+                    <w:rFonts w:ascii="Cambria Math" w:hAnsi="Cambria Math"/>
+                    <w:i/>
+                  </w:rPr>
+                </m:ctrlPr>
+              </m:fPr>
+              <m:num>
+                <m:d>
+                  <m:dPr>
+                    <m:ctrlPr>
+                      <w:rPr>
+                        <w:rFonts w:ascii="Cambria Math" w:hAnsi="Cambria Math"/>
+                        <w:i/>
+                      </w:rPr>
+                    </m:ctrlPr>
+                  </m:dPr>
+                  <m:e>
+                    <m:sSup>
+                      <m:sSupPr>
+                        <m:ctrlPr>
+                          <w:rPr>
+                            <w:rFonts w:ascii="Cambria Math" w:hAnsi="Cambria Math"/>
+                            <w:i/>
+                          </w:rPr>
+                        </m:ctrlPr>
+                      </m:sSupPr>
+                      <m:e>
+                        <m:r>
+                          <w:rPr>
+                            <w:rFonts w:ascii="Cambria Math" w:hAnsi="Cambria Math"/>
+                          </w:rPr>
+                          <m:t>e</m:t>
+                        </m:r>
+                      </m:e>
+                      <m:sup>
+                        <m:f>
+                          <m:fPr>
                             <m:ctrlPr>
                               <w:rPr>
                                 <w:rFonts w:ascii="Cambria Math" w:hAnsi="Cambria Math"/>
                                 <w:i/>
                               </w:rPr>
                             </m:ctrlPr>
-                          </m:sSubPr>
-                          <m:e>
+                          </m:fPr>
+                          <m:num>
                             <m:r>
                               <w:rPr>
                                 <w:rFonts w:ascii="Cambria Math" w:hAnsi="Cambria Math"/>
                               </w:rPr>
-                              <m:t>γ</m:t>
+                              <m:t>jω</m:t>
                             </m:r>
-                          </m:e>
-                          <m:sub>
+                          </m:num>
+                          <m:den>
                             <m:r>
                               <w:rPr>
                                 <w:rFonts w:ascii="Cambria Math" w:hAnsi="Cambria Math"/>
                               </w:rPr>
-                              <m:t>ref</m:t>
+                              <m:t>2</m:t>
                             </m:r>
-                          </m:sub>
-                        </m:sSub>
+                          </m:den>
+                        </m:f>
+                      </m:sup>
+                    </m:sSup>
+                    <m:sSup>
+                      <m:sSupPr>
+                        <m:ctrlPr>
+                          <w:rPr>
+                            <w:rFonts w:ascii="Cambria Math" w:hAnsi="Cambria Math"/>
+                            <w:i/>
+                          </w:rPr>
+                        </m:ctrlPr>
+                      </m:sSupPr>
+                      <m:e>
                         <m:r>
                           <w:rPr>
                             <w:rFonts w:ascii="Cambria Math" w:hAnsi="Cambria Math"/>
-                            <w:lang w:val="da-DK"/>
                           </w:rPr>
-                          <m:t>·</m:t>
+                          <m:t>e</m:t>
                         </m:r>
-                        <m:d>
-                          <m:dPr>
+                      </m:e>
+                      <m:sup>
+                        <m:r>
+                          <w:rPr>
+                            <w:rFonts w:ascii="Cambria Math" w:hAnsi="Cambria Math"/>
+                          </w:rPr>
+                          <m:t>-</m:t>
+                        </m:r>
+                        <m:f>
+                          <m:fPr>
                             <m:ctrlPr>
                               <w:rPr>
                                 <w:rFonts w:ascii="Cambria Math" w:hAnsi="Cambria Math"/>
                                 <w:i/>
                               </w:rPr>
                             </m:ctrlPr>
-                          </m:dPr>
-                          <m:e>
-                            <m:sSub>
-                              <m:sSubPr>
-                                <m:ctrlPr>
-                                  <w:rPr>
-                                    <w:rFonts w:ascii="Cambria Math" w:hAnsi="Cambria Math"/>
-                                    <w:i/>
-                                  </w:rPr>
-                                </m:ctrlPr>
-                              </m:sSubPr>
-                              <m:e>
-                                <m:r>
-                                  <w:rPr>
-                                    <w:rFonts w:ascii="Cambria Math" w:hAnsi="Cambria Math"/>
-                                  </w:rPr>
-                                  <m:t>d</m:t>
-                                </m:r>
-                              </m:e>
-                              <m:sub>
-                                <m:r>
-                                  <w:rPr>
-                                    <w:rFonts w:ascii="Cambria Math" w:hAnsi="Cambria Math"/>
-                                  </w:rPr>
-                                  <m:t>sub</m:t>
-                                </m:r>
-                              </m:sub>
-                            </m:sSub>
+                          </m:fPr>
+                          <m:num>
                             <m:r>
                               <w:rPr>
                                 <w:rFonts w:ascii="Cambria Math" w:hAnsi="Cambria Math"/>
-                                <w:lang w:val="da-DK"/>
                               </w:rPr>
-                              <m:t>-</m:t>
+                              <m:t>jω</m:t>
                             </m:r>
-                            <m:sSub>
-                              <m:sSubPr>
-                                <m:ctrlPr>
-                                  <w:rPr>
-                                    <w:rFonts w:ascii="Cambria Math" w:hAnsi="Cambria Math"/>
-                                    <w:i/>
-                                  </w:rPr>
-                                </m:ctrlPr>
-                              </m:sSubPr>
-                              <m:e>
-                                <m:r>
-                                  <w:rPr>
-                                    <w:rFonts w:ascii="Cambria Math" w:hAnsi="Cambria Math"/>
-                                  </w:rPr>
-                                  <m:t>d</m:t>
-                                </m:r>
-                              </m:e>
-                              <m:sub>
-                                <m:r>
-                                  <w:rPr>
-                                    <w:rFonts w:ascii="Cambria Math" w:hAnsi="Cambria Math"/>
-                                  </w:rPr>
-                                  <m:t>ref</m:t>
-                                </m:r>
-                              </m:sub>
-                            </m:sSub>
-                          </m:e>
-                        </m:d>
+                          </m:num>
+                          <m:den>
+                            <m:r>
+                              <w:rPr>
+                                <w:rFonts w:ascii="Cambria Math" w:hAnsi="Cambria Math"/>
+                              </w:rPr>
+                              <m:t>2</m:t>
+                            </m:r>
+                          </m:den>
+                        </m:f>
                       </m:sup>
                     </m:sSup>
-                  </m:num>
-                  <m:den>
                     <m:r>
                       <w:rPr>
                         <w:rFonts w:ascii="Cambria Math" w:hAnsi="Cambria Math"/>
                       </w:rPr>
-                      <m:t>T</m:t>
+                      <m:t>+</m:t>
                     </m:r>
-                  </m:den>
-                </m:f>
+                    <m:sSup>
+                      <m:sSupPr>
+                        <m:ctrlPr>
+                          <w:rPr>
+                            <w:rFonts w:ascii="Cambria Math" w:hAnsi="Cambria Math"/>
+                            <w:i/>
+                          </w:rPr>
+                        </m:ctrlPr>
+                      </m:sSupPr>
+                      <m:e>
+                        <m:r>
+                          <w:rPr>
+                            <w:rFonts w:ascii="Cambria Math" w:hAnsi="Cambria Math"/>
+                          </w:rPr>
+                          <m:t>e</m:t>
+                        </m:r>
+                      </m:e>
+                      <m:sup>
+                        <m:f>
+                          <m:fPr>
+                            <m:ctrlPr>
+                              <w:rPr>
+                                <w:rFonts w:ascii="Cambria Math" w:hAnsi="Cambria Math"/>
+                                <w:i/>
+                              </w:rPr>
+                            </m:ctrlPr>
+                          </m:fPr>
+                          <m:num>
+                            <m:r>
+                              <w:rPr>
+                                <w:rFonts w:ascii="Cambria Math" w:hAnsi="Cambria Math"/>
+                              </w:rPr>
+                              <m:t>jω</m:t>
+                            </m:r>
+                          </m:num>
+                          <m:den>
+                            <m:r>
+                              <w:rPr>
+                                <w:rFonts w:ascii="Cambria Math" w:hAnsi="Cambria Math"/>
+                              </w:rPr>
+                              <m:t>2</m:t>
+                            </m:r>
+                          </m:den>
+                        </m:f>
+                      </m:sup>
+                    </m:sSup>
+                    <m:sSup>
+                      <m:sSupPr>
+                        <m:ctrlPr>
+                          <w:rPr>
+                            <w:rFonts w:ascii="Cambria Math" w:hAnsi="Cambria Math"/>
+                            <w:i/>
+                          </w:rPr>
+                        </m:ctrlPr>
+                      </m:sSupPr>
+                      <m:e>
+                        <m:r>
+                          <w:rPr>
+                            <w:rFonts w:ascii="Cambria Math" w:hAnsi="Cambria Math"/>
+                          </w:rPr>
+                          <m:t>e</m:t>
+                        </m:r>
+                      </m:e>
+                      <m:sup>
+                        <m:f>
+                          <m:fPr>
+                            <m:ctrlPr>
+                              <w:rPr>
+                                <w:rFonts w:ascii="Cambria Math" w:hAnsi="Cambria Math"/>
+                                <w:i/>
+                              </w:rPr>
+                            </m:ctrlPr>
+                          </m:fPr>
+                          <m:num>
+                            <m:r>
+                              <w:rPr>
+                                <w:rFonts w:ascii="Cambria Math" w:hAnsi="Cambria Math"/>
+                              </w:rPr>
+                              <m:t>jω</m:t>
+                            </m:r>
+                          </m:num>
+                          <m:den>
+                            <m:r>
+                              <w:rPr>
+                                <w:rFonts w:ascii="Cambria Math" w:hAnsi="Cambria Math"/>
+                              </w:rPr>
+                              <m:t>2</m:t>
+                            </m:r>
+                          </m:den>
+                        </m:f>
+                      </m:sup>
+                    </m:sSup>
+                  </m:e>
+                </m:d>
+              </m:num>
+              <m:den>
+                <m:r>
+                  <w:rPr>
+                    <w:rFonts w:ascii="Cambria Math" w:hAnsi="Cambria Math"/>
+                  </w:rPr>
+                  <m:t>2</m:t>
+                </m:r>
+              </m:den>
+            </m:f>
+          </m:num>
+          <m:den>
+            <m:r>
+              <w:rPr>
+                <w:rFonts w:ascii="Cambria Math" w:hAnsi="Cambria Math"/>
+              </w:rPr>
+              <m:t>j</m:t>
+            </m:r>
+            <m:func>
+              <m:funcPr>
+                <m:ctrlPr>
+                  <w:rPr>
+                    <w:rFonts w:ascii="Cambria Math" w:hAnsi="Cambria Math"/>
+                    <w:i/>
+                  </w:rPr>
+                </m:ctrlPr>
+              </m:funcPr>
+              <m:fName>
+                <m:r>
+                  <m:rPr>
+                    <m:sty m:val="p"/>
+                  </m:rPr>
+                  <w:rPr>
+                    <w:rFonts w:ascii="Cambria Math" w:hAnsi="Cambria Math"/>
+                  </w:rPr>
+                  <m:t>sin</m:t>
+                </m:r>
+              </m:fName>
+              <m:e>
+                <m:d>
+                  <m:dPr>
+                    <m:ctrlPr>
+                      <w:rPr>
+                        <w:rFonts w:ascii="Cambria Math" w:hAnsi="Cambria Math"/>
+                        <w:i/>
+                      </w:rPr>
+                    </m:ctrlPr>
+                  </m:dPr>
+                  <m:e>
+                    <m:r>
+                      <w:rPr>
+                        <w:rFonts w:ascii="Cambria Math" w:hAnsi="Cambria Math"/>
+                      </w:rPr>
+                      <m:t>ω</m:t>
+                    </m:r>
+                  </m:e>
+                </m:d>
               </m:e>
-            </m:d>
-            <m:r>
-              <w:rPr>
-                <w:rFonts w:ascii="Cambria Math" w:hAnsi="Cambria Math"/>
-                <w:lang w:val="da-DK"/>
-              </w:rPr>
-              <m:t>-</m:t>
-            </m:r>
-            <m:sSub>
-              <m:sSubPr>
-                <m:ctrlPr>
-                  <w:rPr>
-                    <w:rFonts w:ascii="Cambria Math" w:hAnsi="Cambria Math"/>
-                    <w:i/>
-                  </w:rPr>
-                </m:ctrlPr>
-              </m:sSubPr>
-              <m:e>
-                <m:r>
-                  <w:rPr>
-                    <w:rFonts w:ascii="Cambria Math" w:hAnsi="Cambria Math"/>
-                  </w:rPr>
-                  <m:t>n</m:t>
-                </m:r>
-              </m:e>
-              <m:sub>
-                <m:r>
-                  <w:rPr>
-                    <w:rFonts w:ascii="Cambria Math" w:hAnsi="Cambria Math"/>
-                  </w:rPr>
-                  <m:t>ref</m:t>
-                </m:r>
-              </m:sub>
-            </m:sSub>
-          </m:e>
-        </m:rad>
+            </m:func>
+          </m:den>
+        </m:f>
       </m:oMath>
       <w:r>
         <w:t xml:space="preserve"> </w:t>
       </w:r>
       <w:r>
-        <w:t xml:space="preserve">   </w:t>
+        <w:br/>
+      </w:r>
+      <m:oMath>
+        <m:f>
+          <m:fPr>
+            <m:ctrlPr>
+              <w:rPr>
+                <w:rFonts w:ascii="Cambria Math" w:hAnsi="Cambria Math"/>
+                <w:i/>
+              </w:rPr>
+            </m:ctrlPr>
+          </m:fPr>
+          <m:num>
+            <m:r>
+              <w:rPr>
+                <w:rFonts w:ascii="Cambria Math" w:hAnsi="Cambria Math"/>
+              </w:rPr>
+              <m:t>1</m:t>
+            </m:r>
+          </m:num>
+          <m:den>
+            <m:d>
+              <m:dPr>
+                <m:ctrlPr>
+                  <w:rPr>
+                    <w:rFonts w:ascii="Cambria Math" w:hAnsi="Cambria Math"/>
+                    <w:i/>
+                  </w:rPr>
+                </m:ctrlPr>
+              </m:dPr>
+              <m:e>
+                <m:r>
+                  <w:rPr>
+                    <w:rFonts w:ascii="Cambria Math" w:hAnsi="Cambria Math"/>
+                  </w:rPr>
+                  <m:t>1-</m:t>
+                </m:r>
+                <m:sSup>
+                  <m:sSupPr>
+                    <m:ctrlPr>
+                      <w:rPr>
+                        <w:rFonts w:ascii="Cambria Math" w:hAnsi="Cambria Math"/>
+                        <w:i/>
+                      </w:rPr>
+                    </m:ctrlPr>
+                  </m:sSupPr>
+                  <m:e>
+                    <m:r>
+                      <w:rPr>
+                        <w:rFonts w:ascii="Cambria Math" w:hAnsi="Cambria Math"/>
+                      </w:rPr>
+                      <m:t>e</m:t>
+                    </m:r>
+                  </m:e>
+                  <m:sup>
+                    <m:r>
+                      <w:rPr>
+                        <w:rFonts w:ascii="Cambria Math" w:hAnsi="Cambria Math"/>
+                      </w:rPr>
+                      <m:t>-</m:t>
+                    </m:r>
+                    <m:r>
+                      <w:rPr>
+                        <w:rFonts w:ascii="Cambria Math" w:hAnsi="Cambria Math"/>
+                      </w:rPr>
+                      <m:t>jω</m:t>
+                    </m:r>
+                  </m:sup>
+                </m:sSup>
+              </m:e>
+            </m:d>
+          </m:den>
+        </m:f>
+        <m:r>
+          <w:rPr>
+            <w:rFonts w:ascii="Cambria Math" w:hAnsi="Cambria Math"/>
+          </w:rPr>
+          <m:t>=</m:t>
+        </m:r>
+        <m:f>
+          <m:fPr>
+            <m:ctrlPr>
+              <w:rPr>
+                <w:rFonts w:ascii="Cambria Math" w:hAnsi="Cambria Math"/>
+                <w:i/>
+              </w:rPr>
+            </m:ctrlPr>
+          </m:fPr>
+          <m:num>
+            <m:sSup>
+              <m:sSupPr>
+                <m:ctrlPr>
+                  <w:rPr>
+                    <w:rFonts w:ascii="Cambria Math" w:hAnsi="Cambria Math"/>
+                    <w:i/>
+                  </w:rPr>
+                </m:ctrlPr>
+              </m:sSupPr>
+              <m:e>
+                <m:r>
+                  <w:rPr>
+                    <w:rFonts w:ascii="Cambria Math" w:hAnsi="Cambria Math"/>
+                  </w:rPr>
+                  <m:t>e</m:t>
+                </m:r>
+              </m:e>
+              <m:sup>
+                <m:f>
+                  <m:fPr>
+                    <m:ctrlPr>
+                      <w:rPr>
+                        <w:rFonts w:ascii="Cambria Math" w:hAnsi="Cambria Math"/>
+                        <w:i/>
+                      </w:rPr>
+                    </m:ctrlPr>
+                  </m:fPr>
+                  <m:num>
+                    <m:r>
+                      <w:rPr>
+                        <w:rFonts w:ascii="Cambria Math" w:hAnsi="Cambria Math"/>
+                      </w:rPr>
+                      <m:t>jω</m:t>
+                    </m:r>
+                  </m:num>
+                  <m:den>
+                    <m:r>
+                      <w:rPr>
+                        <w:rFonts w:ascii="Cambria Math" w:hAnsi="Cambria Math"/>
+                      </w:rPr>
+                      <m:t>2</m:t>
+                    </m:r>
+                  </m:den>
+                </m:f>
+              </m:sup>
+            </m:sSup>
+            <m:r>
+              <w:rPr>
+                <w:rFonts w:ascii="Cambria Math" w:hAnsi="Cambria Math"/>
+              </w:rPr>
+              <m:t>·</m:t>
+            </m:r>
+            <m:f>
+              <m:fPr>
+                <m:ctrlPr>
+                  <w:rPr>
+                    <w:rFonts w:ascii="Cambria Math" w:hAnsi="Cambria Math"/>
+                    <w:i/>
+                  </w:rPr>
+                </m:ctrlPr>
+              </m:fPr>
+              <m:num>
+                <m:d>
+                  <m:dPr>
+                    <m:ctrlPr>
+                      <w:rPr>
+                        <w:rFonts w:ascii="Cambria Math" w:hAnsi="Cambria Math"/>
+                        <w:i/>
+                      </w:rPr>
+                    </m:ctrlPr>
+                  </m:dPr>
+                  <m:e>
+                    <m:sSup>
+                      <m:sSupPr>
+                        <m:ctrlPr>
+                          <w:rPr>
+                            <w:rFonts w:ascii="Cambria Math" w:hAnsi="Cambria Math"/>
+                            <w:i/>
+                          </w:rPr>
+                        </m:ctrlPr>
+                      </m:sSupPr>
+                      <m:e>
+                        <m:r>
+                          <w:rPr>
+                            <w:rFonts w:ascii="Cambria Math" w:hAnsi="Cambria Math"/>
+                          </w:rPr>
+                          <m:t>e</m:t>
+                        </m:r>
+                      </m:e>
+                      <m:sup>
+                        <m:f>
+                          <m:fPr>
+                            <m:ctrlPr>
+                              <w:rPr>
+                                <w:rFonts w:ascii="Cambria Math" w:hAnsi="Cambria Math"/>
+                                <w:i/>
+                              </w:rPr>
+                            </m:ctrlPr>
+                          </m:fPr>
+                          <m:num>
+                            <m:r>
+                              <w:rPr>
+                                <w:rFonts w:ascii="Cambria Math" w:hAnsi="Cambria Math"/>
+                              </w:rPr>
+                              <m:t>jω</m:t>
+                            </m:r>
+                          </m:num>
+                          <m:den>
+                            <m:r>
+                              <w:rPr>
+                                <w:rFonts w:ascii="Cambria Math" w:hAnsi="Cambria Math"/>
+                              </w:rPr>
+                              <m:t>2</m:t>
+                            </m:r>
+                          </m:den>
+                        </m:f>
+                      </m:sup>
+                    </m:sSup>
+                    <m:r>
+                      <w:rPr>
+                        <w:rFonts w:ascii="Cambria Math" w:hAnsi="Cambria Math"/>
+                      </w:rPr>
+                      <m:t>+</m:t>
+                    </m:r>
+                    <m:sSup>
+                      <m:sSupPr>
+                        <m:ctrlPr>
+                          <w:rPr>
+                            <w:rFonts w:ascii="Cambria Math" w:hAnsi="Cambria Math"/>
+                            <w:i/>
+                          </w:rPr>
+                        </m:ctrlPr>
+                      </m:sSupPr>
+                      <m:e>
+                        <m:r>
+                          <w:rPr>
+                            <w:rFonts w:ascii="Cambria Math" w:hAnsi="Cambria Math"/>
+                          </w:rPr>
+                          <m:t>e</m:t>
+                        </m:r>
+                      </m:e>
+                      <m:sup>
+                        <m:r>
+                          <w:rPr>
+                            <w:rFonts w:ascii="Cambria Math" w:hAnsi="Cambria Math"/>
+                          </w:rPr>
+                          <m:t>-</m:t>
+                        </m:r>
+                        <m:f>
+                          <m:fPr>
+                            <m:ctrlPr>
+                              <w:rPr>
+                                <w:rFonts w:ascii="Cambria Math" w:hAnsi="Cambria Math"/>
+                                <w:i/>
+                              </w:rPr>
+                            </m:ctrlPr>
+                          </m:fPr>
+                          <m:num>
+                            <m:r>
+                              <w:rPr>
+                                <w:rFonts w:ascii="Cambria Math" w:hAnsi="Cambria Math"/>
+                              </w:rPr>
+                              <m:t>jω</m:t>
+                            </m:r>
+                          </m:num>
+                          <m:den>
+                            <m:r>
+                              <w:rPr>
+                                <w:rFonts w:ascii="Cambria Math" w:hAnsi="Cambria Math"/>
+                              </w:rPr>
+                              <m:t>2</m:t>
+                            </m:r>
+                          </m:den>
+                        </m:f>
+                      </m:sup>
+                    </m:sSup>
+                  </m:e>
+                </m:d>
+              </m:num>
+              <m:den>
+                <m:r>
+                  <w:rPr>
+                    <w:rFonts w:ascii="Cambria Math" w:hAnsi="Cambria Math"/>
+                  </w:rPr>
+                  <m:t>2</m:t>
+                </m:r>
+              </m:den>
+            </m:f>
+          </m:num>
+          <m:den>
+            <m:r>
+              <w:rPr>
+                <w:rFonts w:ascii="Cambria Math" w:hAnsi="Cambria Math"/>
+              </w:rPr>
+              <m:t>j</m:t>
+            </m:r>
+            <m:func>
+              <m:funcPr>
+                <m:ctrlPr>
+                  <w:rPr>
+                    <w:rFonts w:ascii="Cambria Math" w:hAnsi="Cambria Math"/>
+                    <w:i/>
+                  </w:rPr>
+                </m:ctrlPr>
+              </m:funcPr>
+              <m:fName>
+                <m:r>
+                  <m:rPr>
+                    <m:sty m:val="p"/>
+                  </m:rPr>
+                  <w:rPr>
+                    <w:rFonts w:ascii="Cambria Math" w:hAnsi="Cambria Math"/>
+                  </w:rPr>
+                  <m:t>sin</m:t>
+                </m:r>
+              </m:fName>
+              <m:e>
+                <m:d>
+                  <m:dPr>
+                    <m:ctrlPr>
+                      <w:rPr>
+                        <w:rFonts w:ascii="Cambria Math" w:hAnsi="Cambria Math"/>
+                        <w:i/>
+                      </w:rPr>
+                    </m:ctrlPr>
+                  </m:dPr>
+                  <m:e>
+                    <m:r>
+                      <w:rPr>
+                        <w:rFonts w:ascii="Cambria Math" w:hAnsi="Cambria Math"/>
+                      </w:rPr>
+                      <m:t>ω</m:t>
+                    </m:r>
+                  </m:e>
+                </m:d>
+              </m:e>
+            </m:func>
+          </m:den>
+        </m:f>
+        <m:r>
+          <w:rPr>
+            <w:rFonts w:ascii="Cambria Math" w:hAnsi="Cambria Math"/>
+          </w:rPr>
+          <m:t>=</m:t>
+        </m:r>
+        <m:f>
+          <m:fPr>
+            <m:ctrlPr>
+              <w:rPr>
+                <w:rFonts w:ascii="Cambria Math" w:hAnsi="Cambria Math"/>
+                <w:i/>
+              </w:rPr>
+            </m:ctrlPr>
+          </m:fPr>
+          <m:num>
+            <m:sSup>
+              <m:sSupPr>
+                <m:ctrlPr>
+                  <w:rPr>
+                    <w:rFonts w:ascii="Cambria Math" w:hAnsi="Cambria Math"/>
+                    <w:i/>
+                  </w:rPr>
+                </m:ctrlPr>
+              </m:sSupPr>
+              <m:e>
+                <m:r>
+                  <w:rPr>
+                    <w:rFonts w:ascii="Cambria Math" w:hAnsi="Cambria Math"/>
+                  </w:rPr>
+                  <m:t>e</m:t>
+                </m:r>
+              </m:e>
+              <m:sup>
+                <m:f>
+                  <m:fPr>
+                    <m:ctrlPr>
+                      <w:rPr>
+                        <w:rFonts w:ascii="Cambria Math" w:hAnsi="Cambria Math"/>
+                        <w:i/>
+                      </w:rPr>
+                    </m:ctrlPr>
+                  </m:fPr>
+                  <m:num>
+                    <m:r>
+                      <w:rPr>
+                        <w:rFonts w:ascii="Cambria Math" w:hAnsi="Cambria Math"/>
+                      </w:rPr>
+                      <m:t>jω</m:t>
+                    </m:r>
+                  </m:num>
+                  <m:den>
+                    <m:r>
+                      <w:rPr>
+                        <w:rFonts w:ascii="Cambria Math" w:hAnsi="Cambria Math"/>
+                      </w:rPr>
+                      <m:t>2</m:t>
+                    </m:r>
+                  </m:den>
+                </m:f>
+              </m:sup>
+            </m:sSup>
+            <m:r>
+              <w:rPr>
+                <w:rFonts w:ascii="Cambria Math" w:hAnsi="Cambria Math"/>
+              </w:rPr>
+              <m:t>·</m:t>
+            </m:r>
+            <m:func>
+              <m:funcPr>
+                <m:ctrlPr>
+                  <w:rPr>
+                    <w:rFonts w:ascii="Cambria Math" w:hAnsi="Cambria Math"/>
+                    <w:i/>
+                  </w:rPr>
+                </m:ctrlPr>
+              </m:funcPr>
+              <m:fName>
+                <m:r>
+                  <m:rPr>
+                    <m:sty m:val="p"/>
+                  </m:rPr>
+                  <w:rPr>
+                    <w:rFonts w:ascii="Cambria Math" w:hAnsi="Cambria Math"/>
+                  </w:rPr>
+                  <m:t>cos</m:t>
+                </m:r>
+              </m:fName>
+              <m:e>
+                <m:d>
+                  <m:dPr>
+                    <m:ctrlPr>
+                      <w:rPr>
+                        <w:rFonts w:ascii="Cambria Math" w:hAnsi="Cambria Math"/>
+                        <w:i/>
+                      </w:rPr>
+                    </m:ctrlPr>
+                  </m:dPr>
+                  <m:e>
+                    <m:f>
+                      <m:fPr>
+                        <m:ctrlPr>
+                          <w:rPr>
+                            <w:rFonts w:ascii="Cambria Math" w:hAnsi="Cambria Math"/>
+                            <w:i/>
+                          </w:rPr>
+                        </m:ctrlPr>
+                      </m:fPr>
+                      <m:num>
+                        <m:r>
+                          <w:rPr>
+                            <w:rFonts w:ascii="Cambria Math" w:hAnsi="Cambria Math"/>
+                          </w:rPr>
+                          <m:t>ω</m:t>
+                        </m:r>
+                      </m:num>
+                      <m:den>
+                        <m:r>
+                          <w:rPr>
+                            <w:rFonts w:ascii="Cambria Math" w:hAnsi="Cambria Math"/>
+                          </w:rPr>
+                          <m:t>2</m:t>
+                        </m:r>
+                      </m:den>
+                    </m:f>
+                  </m:e>
+                </m:d>
+              </m:e>
+            </m:func>
+          </m:num>
+          <m:den>
+            <m:r>
+              <w:rPr>
+                <w:rFonts w:ascii="Cambria Math" w:hAnsi="Cambria Math"/>
+              </w:rPr>
+              <m:t>j</m:t>
+            </m:r>
+            <m:func>
+              <m:funcPr>
+                <m:ctrlPr>
+                  <w:rPr>
+                    <w:rFonts w:ascii="Cambria Math" w:hAnsi="Cambria Math"/>
+                    <w:i/>
+                  </w:rPr>
+                </m:ctrlPr>
+              </m:funcPr>
+              <m:fName>
+                <m:r>
+                  <m:rPr>
+                    <m:sty m:val="p"/>
+                  </m:rPr>
+                  <w:rPr>
+                    <w:rFonts w:ascii="Cambria Math" w:hAnsi="Cambria Math"/>
+                  </w:rPr>
+                  <m:t>sin</m:t>
+                </m:r>
+              </m:fName>
+              <m:e>
+                <m:d>
+                  <m:dPr>
+                    <m:ctrlPr>
+                      <w:rPr>
+                        <w:rFonts w:ascii="Cambria Math" w:hAnsi="Cambria Math"/>
+                        <w:i/>
+                      </w:rPr>
+                    </m:ctrlPr>
+                  </m:dPr>
+                  <m:e>
+                    <m:r>
+                      <w:rPr>
+                        <w:rFonts w:ascii="Cambria Math" w:hAnsi="Cambria Math"/>
+                      </w:rPr>
+                      <m:t>ω</m:t>
+                    </m:r>
+                  </m:e>
+                </m:d>
+              </m:e>
+            </m:func>
+          </m:den>
+        </m:f>
+        <m:r>
+          <w:rPr>
+            <w:rFonts w:ascii="Cambria Math" w:hAnsi="Cambria Math"/>
+          </w:rPr>
+          <m:t>·</m:t>
+        </m:r>
+        <m:f>
+          <m:fPr>
+            <m:ctrlPr>
+              <w:rPr>
+                <w:rFonts w:ascii="Cambria Math" w:hAnsi="Cambria Math"/>
+                <w:i/>
+              </w:rPr>
+            </m:ctrlPr>
+          </m:fPr>
+          <m:num>
+            <m:r>
+              <w:rPr>
+                <w:rFonts w:ascii="Cambria Math" w:hAnsi="Cambria Math"/>
+              </w:rPr>
+              <m:t>j</m:t>
+            </m:r>
+          </m:num>
+          <m:den>
+            <m:r>
+              <w:rPr>
+                <w:rFonts w:ascii="Cambria Math" w:hAnsi="Cambria Math"/>
+              </w:rPr>
+              <m:t>j</m:t>
+            </m:r>
+          </m:den>
+        </m:f>
+        <m:r>
+          <w:rPr>
+            <w:rFonts w:ascii="Cambria Math" w:hAnsi="Cambria Math"/>
+          </w:rPr>
+          <m:t>=-j·</m:t>
+        </m:r>
+        <m:f>
+          <m:fPr>
+            <m:ctrlPr>
+              <w:rPr>
+                <w:rFonts w:ascii="Cambria Math" w:hAnsi="Cambria Math"/>
+                <w:i/>
+              </w:rPr>
+            </m:ctrlPr>
+          </m:fPr>
+          <m:num>
+            <m:sSup>
+              <m:sSupPr>
+                <m:ctrlPr>
+                  <w:rPr>
+                    <w:rFonts w:ascii="Cambria Math" w:hAnsi="Cambria Math"/>
+                    <w:i/>
+                  </w:rPr>
+                </m:ctrlPr>
+              </m:sSupPr>
+              <m:e>
+                <m:r>
+                  <w:rPr>
+                    <w:rFonts w:ascii="Cambria Math" w:hAnsi="Cambria Math"/>
+                  </w:rPr>
+                  <m:t>e</m:t>
+                </m:r>
+              </m:e>
+              <m:sup>
+                <m:f>
+                  <m:fPr>
+                    <m:ctrlPr>
+                      <w:rPr>
+                        <w:rFonts w:ascii="Cambria Math" w:hAnsi="Cambria Math"/>
+                        <w:i/>
+                      </w:rPr>
+                    </m:ctrlPr>
+                  </m:fPr>
+                  <m:num>
+                    <m:r>
+                      <w:rPr>
+                        <w:rFonts w:ascii="Cambria Math" w:hAnsi="Cambria Math"/>
+                      </w:rPr>
+                      <m:t>jω</m:t>
+                    </m:r>
+                  </m:num>
+                  <m:den>
+                    <m:r>
+                      <w:rPr>
+                        <w:rFonts w:ascii="Cambria Math" w:hAnsi="Cambria Math"/>
+                      </w:rPr>
+                      <m:t>2</m:t>
+                    </m:r>
+                  </m:den>
+                </m:f>
+              </m:sup>
+            </m:sSup>
+            <m:r>
+              <w:rPr>
+                <w:rFonts w:ascii="Cambria Math" w:hAnsi="Cambria Math"/>
+              </w:rPr>
+              <m:t>·</m:t>
+            </m:r>
+            <m:func>
+              <m:funcPr>
+                <m:ctrlPr>
+                  <w:rPr>
+                    <w:rFonts w:ascii="Cambria Math" w:hAnsi="Cambria Math"/>
+                    <w:i/>
+                  </w:rPr>
+                </m:ctrlPr>
+              </m:funcPr>
+              <m:fName>
+                <m:r>
+                  <m:rPr>
+                    <m:sty m:val="p"/>
+                  </m:rPr>
+                  <w:rPr>
+                    <w:rFonts w:ascii="Cambria Math" w:hAnsi="Cambria Math"/>
+                  </w:rPr>
+                  <m:t>cos</m:t>
+                </m:r>
+              </m:fName>
+              <m:e>
+                <m:d>
+                  <m:dPr>
+                    <m:ctrlPr>
+                      <w:rPr>
+                        <w:rFonts w:ascii="Cambria Math" w:hAnsi="Cambria Math"/>
+                        <w:i/>
+                      </w:rPr>
+                    </m:ctrlPr>
+                  </m:dPr>
+                  <m:e>
+                    <m:f>
+                      <m:fPr>
+                        <m:ctrlPr>
+                          <w:rPr>
+                            <w:rFonts w:ascii="Cambria Math" w:hAnsi="Cambria Math"/>
+                            <w:i/>
+                          </w:rPr>
+                        </m:ctrlPr>
+                      </m:fPr>
+                      <m:num>
+                        <m:r>
+                          <w:rPr>
+                            <w:rFonts w:ascii="Cambria Math" w:hAnsi="Cambria Math"/>
+                          </w:rPr>
+                          <m:t>ω</m:t>
+                        </m:r>
+                      </m:num>
+                      <m:den>
+                        <m:r>
+                          <w:rPr>
+                            <w:rFonts w:ascii="Cambria Math" w:hAnsi="Cambria Math"/>
+                          </w:rPr>
+                          <m:t>2</m:t>
+                        </m:r>
+                      </m:den>
+                    </m:f>
+                  </m:e>
+                </m:d>
+              </m:e>
+            </m:func>
+          </m:num>
+          <m:den>
+            <m:func>
+              <m:funcPr>
+                <m:ctrlPr>
+                  <w:rPr>
+                    <w:rFonts w:ascii="Cambria Math" w:hAnsi="Cambria Math"/>
+                    <w:i/>
+                  </w:rPr>
+                </m:ctrlPr>
+              </m:funcPr>
+              <m:fName>
+                <m:r>
+                  <m:rPr>
+                    <m:sty m:val="p"/>
+                  </m:rPr>
+                  <w:rPr>
+                    <w:rFonts w:ascii="Cambria Math" w:hAnsi="Cambria Math"/>
+                  </w:rPr>
+                  <m:t>sin</m:t>
+                </m:r>
+              </m:fName>
+              <m:e>
+                <m:d>
+                  <m:dPr>
+                    <m:ctrlPr>
+                      <w:rPr>
+                        <w:rFonts w:ascii="Cambria Math" w:hAnsi="Cambria Math"/>
+                        <w:i/>
+                      </w:rPr>
+                    </m:ctrlPr>
+                  </m:dPr>
+                  <m:e>
+                    <m:r>
+                      <w:rPr>
+                        <w:rFonts w:ascii="Cambria Math" w:hAnsi="Cambria Math"/>
+                      </w:rPr>
+                      <m:t>ω</m:t>
+                    </m:r>
+                  </m:e>
+                </m:d>
+              </m:e>
+            </m:func>
+          </m:den>
+        </m:f>
+        <m:r>
+          <w:rPr>
+            <w:rFonts w:ascii="Cambria Math" w:hAnsi="Cambria Math"/>
+          </w:rPr>
+          <m:t>=</m:t>
+        </m:r>
+        <m:sSup>
+          <m:sSupPr>
+            <m:ctrlPr>
+              <w:rPr>
+                <w:rFonts w:ascii="Cambria Math" w:hAnsi="Cambria Math"/>
+                <w:i/>
+              </w:rPr>
+            </m:ctrlPr>
+          </m:sSupPr>
+          <m:e>
+            <m:r>
+              <w:rPr>
+                <w:rFonts w:ascii="Cambria Math" w:hAnsi="Cambria Math"/>
+              </w:rPr>
+              <m:t>e</m:t>
+            </m:r>
+          </m:e>
+          <m:sup>
+            <m:r>
+              <w:rPr>
+                <w:rFonts w:ascii="Cambria Math" w:hAnsi="Cambria Math"/>
+              </w:rPr>
+              <m:t>jπ</m:t>
+            </m:r>
+          </m:sup>
+        </m:sSup>
+        <m:r>
+          <w:rPr>
+            <w:rFonts w:ascii="Cambria Math" w:hAnsi="Cambria Math"/>
+          </w:rPr>
+          <m:t>·</m:t>
+        </m:r>
+        <m:sSup>
+          <m:sSupPr>
+            <m:ctrlPr>
+              <w:rPr>
+                <w:rFonts w:ascii="Cambria Math" w:hAnsi="Cambria Math"/>
+                <w:i/>
+              </w:rPr>
+            </m:ctrlPr>
+          </m:sSupPr>
+          <m:e>
+            <m:r>
+              <w:rPr>
+                <w:rFonts w:ascii="Cambria Math" w:hAnsi="Cambria Math"/>
+              </w:rPr>
+              <m:t>e</m:t>
+            </m:r>
+          </m:e>
+          <m:sup>
+            <m:f>
+              <m:fPr>
+                <m:ctrlPr>
+                  <w:rPr>
+                    <w:rFonts w:ascii="Cambria Math" w:hAnsi="Cambria Math"/>
+                    <w:i/>
+                  </w:rPr>
+                </m:ctrlPr>
+              </m:fPr>
+              <m:num>
+                <m:r>
+                  <w:rPr>
+                    <w:rFonts w:ascii="Cambria Math" w:hAnsi="Cambria Math"/>
+                  </w:rPr>
+                  <m:t>jπ</m:t>
+                </m:r>
+              </m:num>
+              <m:den>
+                <m:r>
+                  <w:rPr>
+                    <w:rFonts w:ascii="Cambria Math" w:hAnsi="Cambria Math"/>
+                  </w:rPr>
+                  <m:t>2</m:t>
+                </m:r>
+              </m:den>
+            </m:f>
+          </m:sup>
+        </m:sSup>
+        <m:r>
+          <w:rPr>
+            <w:rFonts w:ascii="Cambria Math" w:hAnsi="Cambria Math"/>
+          </w:rPr>
+          <m:t>·</m:t>
+        </m:r>
+        <m:sSup>
+          <m:sSupPr>
+            <m:ctrlPr>
+              <w:rPr>
+                <w:rFonts w:ascii="Cambria Math" w:hAnsi="Cambria Math"/>
+                <w:i/>
+              </w:rPr>
+            </m:ctrlPr>
+          </m:sSupPr>
+          <m:e>
+            <m:r>
+              <w:rPr>
+                <w:rFonts w:ascii="Cambria Math" w:hAnsi="Cambria Math"/>
+              </w:rPr>
+              <m:t>e</m:t>
+            </m:r>
+          </m:e>
+          <m:sup>
+            <m:f>
+              <m:fPr>
+                <m:ctrlPr>
+                  <w:rPr>
+                    <w:rFonts w:ascii="Cambria Math" w:hAnsi="Cambria Math"/>
+                    <w:i/>
+                  </w:rPr>
+                </m:ctrlPr>
+              </m:fPr>
+              <m:num>
+                <m:r>
+                  <w:rPr>
+                    <w:rFonts w:ascii="Cambria Math" w:hAnsi="Cambria Math"/>
+                  </w:rPr>
+                  <m:t>jω</m:t>
+                </m:r>
+              </m:num>
+              <m:den>
+                <m:r>
+                  <w:rPr>
+                    <w:rFonts w:ascii="Cambria Math" w:hAnsi="Cambria Math"/>
+                  </w:rPr>
+                  <m:t>2</m:t>
+                </m:r>
+              </m:den>
+            </m:f>
+          </m:sup>
+        </m:sSup>
+        <m:r>
+          <w:rPr>
+            <w:rFonts w:ascii="Cambria Math" w:hAnsi="Cambria Math"/>
+          </w:rPr>
+          <m:t>·</m:t>
+        </m:r>
+        <m:f>
+          <m:fPr>
+            <m:ctrlPr>
+              <w:rPr>
+                <w:rFonts w:ascii="Cambria Math" w:hAnsi="Cambria Math"/>
+                <w:i/>
+              </w:rPr>
+            </m:ctrlPr>
+          </m:fPr>
+          <m:num>
+            <m:func>
+              <m:funcPr>
+                <m:ctrlPr>
+                  <w:rPr>
+                    <w:rFonts w:ascii="Cambria Math" w:hAnsi="Cambria Math"/>
+                    <w:i/>
+                  </w:rPr>
+                </m:ctrlPr>
+              </m:funcPr>
+              <m:fName>
+                <m:r>
+                  <m:rPr>
+                    <m:sty m:val="p"/>
+                  </m:rPr>
+                  <w:rPr>
+                    <w:rFonts w:ascii="Cambria Math" w:hAnsi="Cambria Math"/>
+                  </w:rPr>
+                  <m:t>cos</m:t>
+                </m:r>
+              </m:fName>
+              <m:e>
+                <m:d>
+                  <m:dPr>
+                    <m:ctrlPr>
+                      <w:rPr>
+                        <w:rFonts w:ascii="Cambria Math" w:hAnsi="Cambria Math"/>
+                        <w:i/>
+                      </w:rPr>
+                    </m:ctrlPr>
+                  </m:dPr>
+                  <m:e>
+                    <m:f>
+                      <m:fPr>
+                        <m:ctrlPr>
+                          <w:rPr>
+                            <w:rFonts w:ascii="Cambria Math" w:hAnsi="Cambria Math"/>
+                            <w:i/>
+                          </w:rPr>
+                        </m:ctrlPr>
+                      </m:fPr>
+                      <m:num>
+                        <m:r>
+                          <w:rPr>
+                            <w:rFonts w:ascii="Cambria Math" w:hAnsi="Cambria Math"/>
+                          </w:rPr>
+                          <m:t>ω</m:t>
+                        </m:r>
+                      </m:num>
+                      <m:den>
+                        <m:r>
+                          <w:rPr>
+                            <w:rFonts w:ascii="Cambria Math" w:hAnsi="Cambria Math"/>
+                          </w:rPr>
+                          <m:t>2</m:t>
+                        </m:r>
+                      </m:den>
+                    </m:f>
+                  </m:e>
+                </m:d>
+              </m:e>
+            </m:func>
+          </m:num>
+          <m:den>
+            <m:func>
+              <m:funcPr>
+                <m:ctrlPr>
+                  <w:rPr>
+                    <w:rFonts w:ascii="Cambria Math" w:hAnsi="Cambria Math"/>
+                    <w:i/>
+                  </w:rPr>
+                </m:ctrlPr>
+              </m:funcPr>
+              <m:fName>
+                <m:r>
+                  <m:rPr>
+                    <m:sty m:val="p"/>
+                  </m:rPr>
+                  <w:rPr>
+                    <w:rFonts w:ascii="Cambria Math" w:hAnsi="Cambria Math"/>
+                  </w:rPr>
+                  <m:t>sin</m:t>
+                </m:r>
+              </m:fName>
+              <m:e>
+                <m:d>
+                  <m:dPr>
+                    <m:ctrlPr>
+                      <w:rPr>
+                        <w:rFonts w:ascii="Cambria Math" w:hAnsi="Cambria Math"/>
+                        <w:i/>
+                      </w:rPr>
+                    </m:ctrlPr>
+                  </m:dPr>
+                  <m:e>
+                    <m:r>
+                      <w:rPr>
+                        <w:rFonts w:ascii="Cambria Math" w:hAnsi="Cambria Math"/>
+                      </w:rPr>
+                      <m:t>ω</m:t>
+                    </m:r>
+                  </m:e>
+                </m:d>
+              </m:e>
+            </m:func>
+          </m:den>
+        </m:f>
+      </m:oMath>
+      <w:r>
+        <w:t xml:space="preserve"> </w:t>
+      </w:r>
+    </w:p>
+    <w:p>
+      <m:oMath>
+        <m:f>
+          <m:fPr>
+            <m:ctrlPr>
+              <w:rPr>
+                <w:rFonts w:ascii="Cambria Math" w:hAnsi="Cambria Math"/>
+                <w:i/>
+              </w:rPr>
+            </m:ctrlPr>
+          </m:fPr>
+          <m:num>
+            <m:r>
+              <w:rPr>
+                <w:rFonts w:ascii="Cambria Math" w:hAnsi="Cambria Math"/>
+              </w:rPr>
+              <m:t>1</m:t>
+            </m:r>
+          </m:num>
+          <m:den>
+            <m:d>
+              <m:dPr>
+                <m:ctrlPr>
+                  <w:rPr>
+                    <w:rFonts w:ascii="Cambria Math" w:hAnsi="Cambria Math"/>
+                    <w:i/>
+                  </w:rPr>
+                </m:ctrlPr>
+              </m:dPr>
+              <m:e>
+                <m:r>
+                  <w:rPr>
+                    <w:rFonts w:ascii="Cambria Math" w:hAnsi="Cambria Math"/>
+                  </w:rPr>
+                  <m:t>1-</m:t>
+                </m:r>
+                <m:sSup>
+                  <m:sSupPr>
+                    <m:ctrlPr>
+                      <w:rPr>
+                        <w:rFonts w:ascii="Cambria Math" w:hAnsi="Cambria Math"/>
+                        <w:i/>
+                      </w:rPr>
+                    </m:ctrlPr>
+                  </m:sSupPr>
+                  <m:e>
+                    <m:r>
+                      <w:rPr>
+                        <w:rFonts w:ascii="Cambria Math" w:hAnsi="Cambria Math"/>
+                      </w:rPr>
+                      <m:t>e</m:t>
+                    </m:r>
+                  </m:e>
+                  <m:sup>
+                    <m:r>
+                      <w:rPr>
+                        <w:rFonts w:ascii="Cambria Math" w:hAnsi="Cambria Math"/>
+                      </w:rPr>
+                      <m:t>-</m:t>
+                    </m:r>
+                    <m:r>
+                      <w:rPr>
+                        <w:rFonts w:ascii="Cambria Math" w:hAnsi="Cambria Math"/>
+                      </w:rPr>
+                      <m:t>jω</m:t>
+                    </m:r>
+                  </m:sup>
+                </m:sSup>
+              </m:e>
+            </m:d>
+          </m:den>
+        </m:f>
+        <m:r>
+          <w:rPr>
+            <w:rFonts w:ascii="Cambria Math" w:hAnsi="Cambria Math"/>
+          </w:rPr>
+          <m:t>=</m:t>
+        </m:r>
+        <m:f>
+          <m:fPr>
+            <m:ctrlPr>
+              <w:rPr>
+                <w:rFonts w:ascii="Cambria Math" w:hAnsi="Cambria Math"/>
+                <w:i/>
+              </w:rPr>
+            </m:ctrlPr>
+          </m:fPr>
+          <m:num>
+            <m:func>
+              <m:funcPr>
+                <m:ctrlPr>
+                  <w:rPr>
+                    <w:rFonts w:ascii="Cambria Math" w:hAnsi="Cambria Math"/>
+                    <w:i/>
+                  </w:rPr>
+                </m:ctrlPr>
+              </m:funcPr>
+              <m:fName>
+                <m:r>
+                  <m:rPr>
+                    <m:sty m:val="p"/>
+                  </m:rPr>
+                  <w:rPr>
+                    <w:rFonts w:ascii="Cambria Math" w:hAnsi="Cambria Math"/>
+                  </w:rPr>
+                  <m:t>cos</m:t>
+                </m:r>
+              </m:fName>
+              <m:e>
+                <m:d>
+                  <m:dPr>
+                    <m:ctrlPr>
+                      <w:rPr>
+                        <w:rFonts w:ascii="Cambria Math" w:hAnsi="Cambria Math"/>
+                        <w:i/>
+                      </w:rPr>
+                    </m:ctrlPr>
+                  </m:dPr>
+                  <m:e>
+                    <m:f>
+                      <m:fPr>
+                        <m:ctrlPr>
+                          <w:rPr>
+                            <w:rFonts w:ascii="Cambria Math" w:hAnsi="Cambria Math"/>
+                            <w:i/>
+                          </w:rPr>
+                        </m:ctrlPr>
+                      </m:fPr>
+                      <m:num>
+                        <m:r>
+                          <w:rPr>
+                            <w:rFonts w:ascii="Cambria Math" w:hAnsi="Cambria Math"/>
+                          </w:rPr>
+                          <m:t>ω</m:t>
+                        </m:r>
+                      </m:num>
+                      <m:den>
+                        <m:r>
+                          <w:rPr>
+                            <w:rFonts w:ascii="Cambria Math" w:hAnsi="Cambria Math"/>
+                          </w:rPr>
+                          <m:t>2</m:t>
+                        </m:r>
+                      </m:den>
+                    </m:f>
+                  </m:e>
+                </m:d>
+              </m:e>
+            </m:func>
+          </m:num>
+          <m:den>
+            <m:func>
+              <m:funcPr>
+                <m:ctrlPr>
+                  <w:rPr>
+                    <w:rFonts w:ascii="Cambria Math" w:hAnsi="Cambria Math"/>
+                    <w:i/>
+                  </w:rPr>
+                </m:ctrlPr>
+              </m:funcPr>
+              <m:fName>
+                <m:r>
+                  <m:rPr>
+                    <m:sty m:val="p"/>
+                  </m:rPr>
+                  <w:rPr>
+                    <w:rFonts w:ascii="Cambria Math" w:hAnsi="Cambria Math"/>
+                  </w:rPr>
+                  <m:t>sin</m:t>
+                </m:r>
+              </m:fName>
+              <m:e>
+                <m:d>
+                  <m:dPr>
+                    <m:ctrlPr>
+                      <w:rPr>
+                        <w:rFonts w:ascii="Cambria Math" w:hAnsi="Cambria Math"/>
+                        <w:i/>
+                      </w:rPr>
+                    </m:ctrlPr>
+                  </m:dPr>
+                  <m:e>
+                    <m:r>
+                      <w:rPr>
+                        <w:rFonts w:ascii="Cambria Math" w:hAnsi="Cambria Math"/>
+                      </w:rPr>
+                      <m:t>ω</m:t>
+                    </m:r>
+                  </m:e>
+                </m:d>
+              </m:e>
+            </m:func>
+          </m:den>
+        </m:f>
+        <m:r>
+          <w:rPr>
+            <w:rFonts w:ascii="Cambria Math" w:hAnsi="Cambria Math"/>
+          </w:rPr>
+          <m:t>·</m:t>
+        </m:r>
+        <m:sSup>
+          <m:sSupPr>
+            <m:ctrlPr>
+              <w:rPr>
+                <w:rFonts w:ascii="Cambria Math" w:hAnsi="Cambria Math"/>
+                <w:i/>
+              </w:rPr>
+            </m:ctrlPr>
+          </m:sSupPr>
+          <m:e>
+            <m:r>
+              <w:rPr>
+                <w:rFonts w:ascii="Cambria Math" w:hAnsi="Cambria Math"/>
+              </w:rPr>
+              <m:t>e</m:t>
+            </m:r>
+          </m:e>
+          <m:sup>
+            <m:r>
+              <w:rPr>
+                <w:rFonts w:ascii="Cambria Math" w:hAnsi="Cambria Math"/>
+              </w:rPr>
+              <m:t>j·</m:t>
+            </m:r>
+            <m:f>
+              <m:fPr>
+                <m:ctrlPr>
+                  <w:rPr>
+                    <w:rFonts w:ascii="Cambria Math" w:hAnsi="Cambria Math"/>
+                    <w:i/>
+                  </w:rPr>
+                </m:ctrlPr>
+              </m:fPr>
+              <m:num>
+                <m:r>
+                  <w:rPr>
+                    <w:rFonts w:ascii="Cambria Math" w:hAnsi="Cambria Math"/>
+                  </w:rPr>
+                  <m:t>1</m:t>
+                </m:r>
+              </m:num>
+              <m:den>
+                <m:r>
+                  <w:rPr>
+                    <w:rFonts w:ascii="Cambria Math" w:hAnsi="Cambria Math"/>
+                  </w:rPr>
+                  <m:t>2</m:t>
+                </m:r>
+              </m:den>
+            </m:f>
+            <m:r>
+              <w:rPr>
+                <w:rFonts w:ascii="Cambria Math" w:hAnsi="Cambria Math"/>
+              </w:rPr>
+              <m:t>·</m:t>
+            </m:r>
+            <m:d>
+              <m:dPr>
+                <m:ctrlPr>
+                  <w:rPr>
+                    <w:rFonts w:ascii="Cambria Math" w:hAnsi="Cambria Math"/>
+                    <w:i/>
+                  </w:rPr>
+                </m:ctrlPr>
+              </m:dPr>
+              <m:e>
+                <m:r>
+                  <w:rPr>
+                    <w:rFonts w:ascii="Cambria Math" w:hAnsi="Cambria Math"/>
+                  </w:rPr>
+                  <m:t>ω+</m:t>
+                </m:r>
+                <m:r>
+                  <w:rPr>
+                    <w:rFonts w:ascii="Cambria Math" w:hAnsi="Cambria Math"/>
+                  </w:rPr>
+                  <m:t>3</m:t>
+                </m:r>
+                <m:r>
+                  <w:rPr>
+                    <w:rFonts w:ascii="Cambria Math" w:hAnsi="Cambria Math"/>
+                  </w:rPr>
+                  <m:t>π</m:t>
+                </m:r>
+              </m:e>
+            </m:d>
+          </m:sup>
+        </m:sSup>
+      </m:oMath>
+      <w:r>
+        <w:t xml:space="preserve"> </w:t>
       </w:r>
     </w:p>
     <w:p/>

</xml_diff>